<commit_message>
Rename AI agent codename Aide -> Neko across docs, prompts, and docx
</commit_message>
<xml_diff>
--- a/rfcs/RFC-000-overview-scope-roadmap.docx
+++ b/rfcs/RFC-000-overview-scope-roadmap.docx
@@ -513,9 +513,9 @@
       <w:pPr>
         <w:pStyle w:val="Heading3"/>
       </w:pPr>
-      <w:bookmarkStart w:id="26" w:name="Xc9e95f4c14a007d99f74011f410e079944e1cfa"/>
-      <w:r>
-        <w:t xml:space="preserve">2.4 AI agent ("Aide" — our Fin equivalent)</w:t>
+      <w:bookmarkStart w:id="26" w:name="X398e653dbe5e7f8ba5341e5ecd1e54be791cefe"/>
+      <w:r>
+        <w:t xml:space="preserve">2.4 AI agent ("Neko" — our Fin equivalent)</w:t>
       </w:r>
       <w:bookmarkEnd w:id="26"/>
     </w:p>
@@ -1454,7 +1454,7 @@
         <w:rPr>
           <w:b/>
         </w:rPr>
-        <w:t xml:space="preserve">Aide v1 (AI agent):</w:t>
+        <w:t xml:space="preserve">Neko v1 (AI agent):</w:t>
       </w:r>
       <w:r>
         <w:t xml:space="preserve"> </w:t>
@@ -1472,7 +1472,7 @@
         <w:pStyle w:val="Compact"/>
       </w:pPr>
       <w:r>
-        <w:t xml:space="preserve">Workflows v1: triggers/conditions/actions incl. "hand to Aide", collect-data bot steps; execution logs.</w:t>
+        <w:t xml:space="preserve">Workflows v1: triggers/conditions/actions incl. "hand to Neko", collect-data bot steps; execution logs.</w:t>
       </w:r>
     </w:p>
     <w:p>
@@ -1541,7 +1541,7 @@
         <w:t xml:space="preserve"> </w:t>
       </w:r>
       <w:r>
-        <w:t xml:space="preserve">Aide ≥35% resolution rate on design-partner traffic (measured per RFC-003 §8 definition); workflow engine at-least-once with zero duplicate side effects in chaos tests; first paying tenants on metered billing.</w:t>
+        <w:t xml:space="preserve">Neko ≥35% resolution rate on design-partner traffic (measured per RFC-003 §8 definition); workflow engine at-least-once with zero duplicate side effects in chaos tests; first paying tenants on metered billing.</w:t>
       </w:r>
     </w:p>
     <w:p>
@@ -1571,7 +1571,7 @@
         <w:pStyle w:val="Compact"/>
       </w:pPr>
       <w:r>
-        <w:t xml:space="preserve">Channels: WhatsApp, Facebook Messenger, Instagram, SMS (Twilio); Aide on email + WhatsApp.</w:t>
+        <w:t xml:space="preserve">Channels: WhatsApp, Facebook Messenger, Instagram, SMS (Twilio); Neko on email + WhatsApp.</w:t>
       </w:r>
     </w:p>
     <w:p>
@@ -1607,7 +1607,7 @@
         <w:pStyle w:val="Compact"/>
       </w:pPr>
       <w:r>
-        <w:t xml:space="preserve">Copilot for agents (drafts, summarize, tone); Aide actions (admin-defined API tools) + custom answers.</w:t>
+        <w:t xml:space="preserve">Copilot for agents (drafts, summarize, tone); Neko actions (admin-defined API tools) + custom answers.</w:t>
       </w:r>
     </w:p>
     <w:p>
@@ -1664,7 +1664,7 @@
         <w:t xml:space="preserve"> </w:t>
       </w:r>
       <w:r>
-        <w:t xml:space="preserve">≥5 channels GA; Aide ≥50% resolution on eligible traffic; series engine survives 10× send-burst load test; app framework has 3 external developers building.</w:t>
+        <w:t xml:space="preserve">≥5 channels GA; Neko ≥50% resolution on eligible traffic; series engine survives 10× send-burst load test; app framework has 3 external developers building.</w:t>
       </w:r>
     </w:p>
     <w:p>
@@ -1686,7 +1686,7 @@
         <w:pStyle w:val="Compact"/>
       </w:pPr>
       <w:r>
-        <w:t xml:space="preserve">Voice channel (SIP/Twilio Voice + realtime speech pipeline) with Aide-on-voice pilot.</w:t>
+        <w:t xml:space="preserve">Voice channel (SIP/Twilio Voice + realtime speech pipeline) with Neko-on-voice pilot.</w:t>
       </w:r>
     </w:p>
     <w:p>
@@ -1698,7 +1698,7 @@
         <w:pStyle w:val="Compact"/>
       </w:pPr>
       <w:r>
-        <w:t xml:space="preserve">Aide v3: procedures (multi-step policies), guidance, per-tenant eval harness, unresolved-topic clustering → content-gap suggestions.</w:t>
+        <w:t xml:space="preserve">Neko v3: procedures (multi-step policies), guidance, per-tenant eval harness, unresolved-topic clustering → content-gap suggestions.</w:t>
       </w:r>
     </w:p>
     <w:p>
@@ -1838,7 +1838,7 @@
         <w:t xml:space="preserve"> </w:t>
       </w:r>
       <w:r>
-        <w:t xml:space="preserve">at 1M Aide conversations/mo, $0.01–0.05 model cost per conversation ⇒ $10–50k/mo, recovered by per-resolution pricing (≈$0.99) with healthy margin (RFC-003 §9). Early phases run at &lt;$2k/mo infra.</w:t>
+        <w:t xml:space="preserve">at 1M Neko conversations/mo, $0.01–0.05 model cost per conversation ⇒ $10–50k/mo, recovered by per-resolution pricing (≈$0.99) with healthy margin (RFC-003 §9). Early phases run at &lt;$2k/mo infra.</w:t>
       </w:r>
     </w:p>
     <w:p>
@@ -1944,7 +1944,7 @@
               <w:jc w:val="left"/>
             </w:pPr>
             <w:r>
-              <w:t xml:space="preserve">Eval harness from day one (RFC-003 §8); curated custom answers; scope Aide to eligible intents first; human-handoff UX that never dead-ends</w:t>
+              <w:t xml:space="preserve">Eval harness from day one (RFC-003 §8); curated custom answers; scope Neko to eligible intents first; human-handoff UX that never dead-ends</w:t>
             </w:r>
           </w:p>
         </w:tc>

</xml_diff>